<commit_message>
Add: Seções 6.5 e 6.6 do notebook
</commit_message>
<xml_diff>
--- a/Relatorio_Progresso_SENSO.docx
+++ b/Relatorio_Progresso_SENSO.docx
@@ -3,9 +3,11 @@
 <w:document xmlns:wpc="http://schemas.microsoft.com/office/word/2010/wordprocessingCanvas" xmlns:cx="http://schemas.microsoft.com/office/drawing/2014/chartex" xmlns:cx1="http://schemas.microsoft.com/office/drawing/2015/9/8/chartex" xmlns:cx2="http://schemas.microsoft.com/office/drawing/2015/10/21/chartex" xmlns:cx3="http://schemas.microsoft.com/office/drawing/2016/5/9/chartex" xmlns:cx4="http://schemas.microsoft.com/office/drawing/2016/5/10/chartex" xmlns:cx5="http://schemas.microsoft.com/office/drawing/2016/5/11/chartex" xmlns:cx6="http://schemas.microsoft.com/office/drawing/2016/5/12/chartex" xmlns:cx7="http://schemas.microsoft.com/office/drawing/2016/5/13/chartex" xmlns:cx8="http://schemas.microsoft.com/office/drawing/2016/5/14/chartex" xmlns:mc="http://schemas.openxmlformats.org/markup-compatibility/2006" xmlns:aink="http://schemas.microsoft.com/office/drawing/2016/ink" xmlns:am3d="http://schemas.microsoft.com/office/drawing/2017/model3d" xmlns:o="urn:schemas-microsoft-com:office:office" xmlns:r="http://schemas.openxmlformats.org/officeDocument/2006/relationships" xmlns:m="http://schemas.openxmlformats.org/officeDocument/2006/math" xmlns:v="urn:schemas-microsoft-com:vml" xmlns:wp14="http://schemas.microsoft.com/office/word/2010/wordprocessingDrawing" xmlns:wp="http://schemas.openxmlformats.org/drawingml/2006/wordprocessingDrawing" xmlns:w10="urn:schemas-microsoft-com:office:word" xmlns:w="http://schemas.openxmlformats.org/wordprocessingml/2006/main" xmlns:w14="http://schemas.microsoft.com/office/word/2010/wordml" xmlns:w15="http://schemas.microsoft.com/office/word/2012/wordml" xmlns:w16cex="http://schemas.microsoft.com/office/word/2018/wordml/cex" xmlns:w16cid="http://schemas.microsoft.com/office/word/2016/wordml/cid" xmlns:w16="http://schemas.microsoft.com/office/word/2018/wordml" xmlns:w16sdtdh="http://schemas.microsoft.com/office/word/2020/wordml/sdtdatahash" xmlns:w16se="http://schemas.microsoft.com/office/word/2015/wordml/symex" xmlns:wpg="http://schemas.microsoft.com/office/word/2010/wordprocessingGroup" xmlns:wpi="http://schemas.microsoft.com/office/word/2010/wordprocessingInk" xmlns:wne="http://schemas.microsoft.com/office/word/2006/wordml" xmlns:wps="http://schemas.microsoft.com/office/word/2010/wordprocessingShape" mc:Ignorable="w14 w15 w16se w16cid w16 w16cex w16sdtdh wp14">
   <w:body>
     <w:p>
+      <w:proofErr w:type="gramStart"/>
       <w:r>
         <w:t>S.ENSO</w:t>
       </w:r>
+      <w:proofErr w:type="gramEnd"/>
     </w:p>
     <w:p>
       <w:r>
@@ -29,7 +31,18 @@
     </w:p>
     <w:p>
       <w:r>
-        <w:t>Global Solution 2026.1 — FIAP | Turma 1TSCOR</w:t>
+        <w:t xml:space="preserve">Global </w:t>
+      </w:r>
+      <w:proofErr w:type="spellStart"/>
+      <w:r>
+        <w:t>Solution</w:t>
+      </w:r>
+      <w:proofErr w:type="spellEnd"/>
+      <w:r>
+        <w:t xml:space="preserve"> 2026.1 — FIAP | </w:t>
+      </w:r>
+      <w:r>
+        <w:t>Turma 1TSCOR</w:t>
       </w:r>
     </w:p>
     <w:p>
@@ -47,17 +60,82 @@
     </w:p>
     <w:p>
       <w:r>
-        <w:t>O S.ENSO é um sistema preditivo que transforma o sinal do fenômeno El Niño-Oscilação Sul (ENSO), captado por satélites oceânicos da NASA e NOAA, em alertas municipais de risco agrícola e de desastres com antecedência de 3 a 6 meses. O projeto responde ao desafio Global Solution 2026.1 da FIAP (1TSCOR — Indústria Espacial).</w:t>
-      </w:r>
-    </w:p>
-    <w:p>
-      <w:r>
-        <w:t>O cenário é crítico e atual: em maio de 2026 o CPC/NOAA confirmou El Niño Watch com probabilidade de 65% de Super El Niño até outubro/2026. ONI atual = +0,9°C com taxa de aceleração de +0,35°C/mês — fenômeno em desenvolvimento ativo.</w:t>
-      </w:r>
-    </w:p>
-    <w:p>
-      <w:r>
-        <w:t>ESTADO ATUAL: O notebook analítico está completamente funcional e executado. Todos os dados foram coletados e integrados. Os resultados estatísticos foram obtidos e validados. O projeto está na fase de finalização do notebook (células interpretativas markdown) antes da produção do dashboard.</w:t>
+        <w:t xml:space="preserve">O </w:t>
+      </w:r>
+      <w:proofErr w:type="gramStart"/>
+      <w:r>
+        <w:t>S.ENSO</w:t>
+      </w:r>
+      <w:proofErr w:type="gramEnd"/>
+      <w:r>
+        <w:t xml:space="preserve"> é um sistema preditivo que transforma o sinal do fenômeno El </w:t>
+      </w:r>
+      <w:proofErr w:type="spellStart"/>
+      <w:r>
+        <w:t>Niño</w:t>
+      </w:r>
+      <w:proofErr w:type="spellEnd"/>
+      <w:r>
+        <w:t>-Oscilação Sul (ENSO), captado por satélites oceânicos da NASA e NOAA, em alertas municipais de risco</w:t>
+      </w:r>
+      <w:r>
+        <w:t xml:space="preserve"> agrícola e de desastres com antecedência de 3 a 6 meses. O projeto responde ao desafio Global </w:t>
+      </w:r>
+      <w:proofErr w:type="spellStart"/>
+      <w:r>
+        <w:t>Solution</w:t>
+      </w:r>
+      <w:proofErr w:type="spellEnd"/>
+      <w:r>
+        <w:t xml:space="preserve"> 2026.1 da FIAP (1TSCOR — Indústria Espacial).</w:t>
+      </w:r>
+    </w:p>
+    <w:p>
+      <w:r>
+        <w:t xml:space="preserve">O cenário é crítico e atual: em maio de 2026 o CPC/NOAA confirmou El </w:t>
+      </w:r>
+      <w:proofErr w:type="spellStart"/>
+      <w:r>
+        <w:t>Niño</w:t>
+      </w:r>
+      <w:proofErr w:type="spellEnd"/>
+      <w:r>
+        <w:t xml:space="preserve"> </w:t>
+      </w:r>
+      <w:proofErr w:type="spellStart"/>
+      <w:r>
+        <w:t>Watch</w:t>
+      </w:r>
+      <w:proofErr w:type="spellEnd"/>
+      <w:r>
+        <w:t xml:space="preserve"> com probabilidade de 65% d</w:t>
+      </w:r>
+      <w:r>
+        <w:t xml:space="preserve">e Super El </w:t>
+      </w:r>
+      <w:proofErr w:type="spellStart"/>
+      <w:r>
+        <w:t>Niño</w:t>
+      </w:r>
+      <w:proofErr w:type="spellEnd"/>
+      <w:r>
+        <w:t xml:space="preserve"> até outubro/2026. ONI atual = +0,9°C com taxa de aceleração de +0,35°C/mês — fenômeno em desenvolvimento ativo.</w:t>
+      </w:r>
+    </w:p>
+    <w:p>
+      <w:r>
+        <w:t>ESTADO ATUAL: O notebook analítico está completamente funcional e executado. Todos os dados foram coletados e integrados. Os res</w:t>
+      </w:r>
+      <w:r>
+        <w:t xml:space="preserve">ultados estatísticos foram obtidos e validados. O projeto está na fase de finalização do notebook (células interpretativas </w:t>
+      </w:r>
+      <w:proofErr w:type="spellStart"/>
+      <w:r>
+        <w:t>markdown</w:t>
+      </w:r>
+      <w:proofErr w:type="spellEnd"/>
+      <w:r>
+        <w:t>) antes da produção do dashboard.</w:t>
       </w:r>
     </w:p>
     <w:p>
@@ -78,7 +156,45 @@
     </w:p>
     <w:p>
       <w:r>
-        <w:t>Pipeline analítico completo implementado: (1) carregamento e integração de 8 fontes de dados, (2) limpeza com winsorização de precipitação, (3) estatística descritiva com boxplots por fase ENSO, (4) amostragem estratificada por fase ENSO validada por KS, (5) análise inferencial completa (lag correlation, Mann-Whitney, regressão múltipla, interação ONI×AMM, correlação GPAT), (6) derivadas e integrais do ONI, (7) score de risco 0–100 com GPAT como índice atlântico operacional, (8) projeções 6 meses e recomendações por persona.</w:t>
+        <w:t>Pipeline analítico completo implementado: (1)</w:t>
+      </w:r>
+      <w:r>
+        <w:t xml:space="preserve"> carregamento e integração de 8 fontes de dados, (2) limpeza com </w:t>
+      </w:r>
+      <w:proofErr w:type="spellStart"/>
+      <w:r>
+        <w:t>winsorização</w:t>
+      </w:r>
+      <w:proofErr w:type="spellEnd"/>
+      <w:r>
+        <w:t xml:space="preserve"> de precipitação, (3) estatística descritiva com </w:t>
+      </w:r>
+      <w:proofErr w:type="spellStart"/>
+      <w:r>
+        <w:t>boxplots</w:t>
+      </w:r>
+      <w:proofErr w:type="spellEnd"/>
+      <w:r>
+        <w:t xml:space="preserve"> por fase ENSO, (4) amostragem estratificada por fase ENSO validada por KS, (5) análise inferencial completa (</w:t>
+      </w:r>
+      <w:proofErr w:type="spellStart"/>
+      <w:r>
+        <w:t>lag</w:t>
+      </w:r>
+      <w:proofErr w:type="spellEnd"/>
+      <w:r>
+        <w:t xml:space="preserve"> </w:t>
+      </w:r>
+      <w:proofErr w:type="spellStart"/>
+      <w:r>
+        <w:t>correlat</w:t>
+      </w:r>
+      <w:r>
+        <w:t>ion</w:t>
+      </w:r>
+      <w:proofErr w:type="spellEnd"/>
+      <w:r>
+        <w:t>, Mann-Whitney, regressão múltipla, interação ONI×AMM, correlação GPAT), (6) derivadas e integrais do ONI, (7) score de risco 0–100 com GPAT como índice atlântico operacional, (8) projeções 6 meses e recomendações por persona.</w:t>
       </w:r>
     </w:p>
     <w:p>
@@ -91,17 +207,55 @@
     </w:p>
     <w:p>
       <w:r>
-        <w:t>Dois municípios-piloto, mantidos conforme planejado:</w:t>
-      </w:r>
-    </w:p>
-    <w:p>
-      <w:r>
-        <w:t>• Quixadá-CE: sertão nordestino, risco de seca, cultura de milho de sequeiro (janela crítica: fev–abr). Persona 1 — Seu João, agricultor familiar.</w:t>
-      </w:r>
-    </w:p>
-    <w:p>
-      <w:r>
-        <w:t>• Lajeado-RS: vale do Taquari, risco de enchente, cultura de trigo (janela crítica: set–nov). Persona 2 — Mariana, coordenadora de Defesa Civil.</w:t>
+        <w:t>Doi</w:t>
+      </w:r>
+      <w:r>
+        <w:t>s municípios-piloto, mantidos conforme planejado:</w:t>
+      </w:r>
+    </w:p>
+    <w:p>
+      <w:r>
+        <w:t xml:space="preserve">• Quixadá-CE: sertão nordestino, risco de seca, cultura de milho de sequeiro (janela crítica: </w:t>
+      </w:r>
+      <w:proofErr w:type="spellStart"/>
+      <w:r>
+        <w:t>fev</w:t>
+      </w:r>
+      <w:proofErr w:type="spellEnd"/>
+      <w:r>
+        <w:t>–</w:t>
+      </w:r>
+      <w:proofErr w:type="spellStart"/>
+      <w:r>
+        <w:t>abr</w:t>
+      </w:r>
+      <w:proofErr w:type="spellEnd"/>
+      <w:r>
+        <w:t>). Persona 1 — Seu João, agricultor familiar.</w:t>
+      </w:r>
+    </w:p>
+    <w:p>
+      <w:r>
+        <w:t xml:space="preserve">• </w:t>
+      </w:r>
+      <w:proofErr w:type="spellStart"/>
+      <w:r>
+        <w:t>Lajeado-RS</w:t>
+      </w:r>
+      <w:proofErr w:type="spellEnd"/>
+      <w:r>
+        <w:t>: vale do Taquari, risco de enchente, cultura d</w:t>
+      </w:r>
+      <w:r>
+        <w:t>e trigo (janela crítica: set–</w:t>
+      </w:r>
+      <w:proofErr w:type="spellStart"/>
+      <w:r>
+        <w:t>nov</w:t>
+      </w:r>
+      <w:proofErr w:type="spellEnd"/>
+      <w:r>
+        <w:t>). Persona 2 — Mariana, coordenadora de Defesa Civil.</w:t>
       </w:r>
     </w:p>
     <w:p>
@@ -114,7 +268,10 @@
     </w:p>
     <w:p>
       <w:r>
-        <w:t>Duas personas: agricultor familiar (ODS 2) e defesa civil municipal (ODS 11 e 13). Recomendações geradas automaticamente no notebook para ambos os perfis e níveis de alerta.</w:t>
+        <w:t>Duas personas: agricultor familiar (ODS 2) e defesa civil municipal (ODS 11 e 13). Recomendações geradas automaticamente no notebook para ambos os perfis</w:t>
+      </w:r>
+      <w:r>
+        <w:t xml:space="preserve"> e níveis de alerta.</w:t>
       </w:r>
     </w:p>
     <w:p>
@@ -127,7 +284,54 @@
     </w:p>
     <w:p>
       <w:r>
-        <w:t>Correlação de Pearson e Spearman com análise de lag 0–12 meses; amostragem estratificada por fase ENSO (7 fases) com validação KS; teste de hipótese Mann-Whitney (El Niño Forte/Super vs. Neutro); regressão linear múltipla OLS (ONI + AMM + sazonalidade + dummies de fase); análise de interação ONI×AMM por quadrantes; correlação GPAT×precipitação; derivada e integral do ONI; score de risco composto 0–100.</w:t>
+        <w:t xml:space="preserve">Correlação de Pearson e </w:t>
+      </w:r>
+      <w:proofErr w:type="spellStart"/>
+      <w:r>
+        <w:t>Spearman</w:t>
+      </w:r>
+      <w:proofErr w:type="spellEnd"/>
+      <w:r>
+        <w:t xml:space="preserve"> com análise de </w:t>
+      </w:r>
+      <w:proofErr w:type="spellStart"/>
+      <w:r>
+        <w:t>lag</w:t>
+      </w:r>
+      <w:proofErr w:type="spellEnd"/>
+      <w:r>
+        <w:t xml:space="preserve"> 0–12 meses; amostragem estratificada por fase ENSO (7 fases) com validação KS; teste de hipótese Mann-Whitney (El </w:t>
+      </w:r>
+      <w:proofErr w:type="spellStart"/>
+      <w:r>
+        <w:t>Niño</w:t>
+      </w:r>
+      <w:proofErr w:type="spellEnd"/>
+      <w:r>
+        <w:t xml:space="preserve"> Forte/Super vs. Neutro); </w:t>
+      </w:r>
+      <w:r>
+        <w:t xml:space="preserve">regressão linear múltipla OLS (ONI + AMM + sazonalidade </w:t>
+      </w:r>
+      <w:r>
+        <w:lastRenderedPageBreak/>
+        <w:t xml:space="preserve">+ </w:t>
+      </w:r>
+      <w:proofErr w:type="spellStart"/>
+      <w:r>
+        <w:t>dummies</w:t>
+      </w:r>
+      <w:proofErr w:type="spellEnd"/>
+      <w:r>
+        <w:t xml:space="preserve"> de fase); análise de interação ONI×AMM por quadrantes; correlação </w:t>
+      </w:r>
+      <w:proofErr w:type="spellStart"/>
+      <w:r>
+        <w:t>GPAT×precipitação</w:t>
+      </w:r>
+      <w:proofErr w:type="spellEnd"/>
+      <w:r>
+        <w:t>; derivada e integral do ONI; score de risco composto 0–100.</w:t>
       </w:r>
     </w:p>
     <w:p>
@@ -135,27 +339,108 @@
         <w:pStyle w:val="Ttulo2"/>
       </w:pPr>
       <w:r>
-        <w:t>2.5 Mudanças de Escopo em Relação ao Plano Original</w:t>
-      </w:r>
-    </w:p>
-    <w:p>
-      <w:r>
-        <w:t>• SSH ENSO Indicator (NASA PO.DAAC) REMOVIDO: dado orbital complementar descartado. Script extract_earthdata.py deletado (continha credenciais sensíveis, já removidas).</w:t>
-      </w:r>
-    </w:p>
-    <w:p>
-      <w:r>
-        <w:t>• AMM (Atlantic Meridional Mode) ADICIONADO como segunda variável preditora. Dado: data/raw/amm_mensal.csv, cobertura 1948–ago/2024.</w:t>
-      </w:r>
-    </w:p>
-    <w:p>
-      <w:r>
-        <w:t>• GPAT (Gradiente Térmico Atlântico Tropical = TNA − TSA) ADICIONADO como substituto operacional do AMM para 2025–2026 (cobertura até dez/2025). Dados: data/raw/tna_mensal.csv + data/raw/tsa_mensal.csv.</w:t>
-      </w:r>
-    </w:p>
-    <w:p>
-      <w:r>
-        <w:t>• Estratégia INMET BDMEP redefinida: dados multi-arquivo (um CSV por estação×ano). CE: A325 Quixeramobim (2007–2017) + A369 Quixadá (2018–2026). RS: A840 Bento Gonçalves (2006–2012) + A882 Teutônia (2013–2026).</w:t>
+        <w:t>2.5 Mudanças de Escopo em Relação ao Plano Ori</w:t>
+      </w:r>
+      <w:r>
+        <w:t>ginal</w:t>
+      </w:r>
+    </w:p>
+    <w:p>
+      <w:r>
+        <w:t xml:space="preserve">• SSH ENSO Indicator (NASA </w:t>
+      </w:r>
+      <w:proofErr w:type="gramStart"/>
+      <w:r>
+        <w:t>PO.DAAC</w:t>
+      </w:r>
+      <w:proofErr w:type="gramEnd"/>
+      <w:r>
+        <w:t>) REMOVIDO: dado orbital complementar descartado. Script extract_earthdata.py deletado (continha credenciais sensíveis, já removidas).</w:t>
+      </w:r>
+    </w:p>
+    <w:p>
+      <w:r>
+        <w:t>• AMM (</w:t>
+      </w:r>
+      <w:proofErr w:type="spellStart"/>
+      <w:r>
+        <w:t>Atlantic</w:t>
+      </w:r>
+      <w:proofErr w:type="spellEnd"/>
+      <w:r>
+        <w:t xml:space="preserve"> Meridional </w:t>
+      </w:r>
+      <w:proofErr w:type="spellStart"/>
+      <w:r>
+        <w:t>Mode</w:t>
+      </w:r>
+      <w:proofErr w:type="spellEnd"/>
+      <w:r>
+        <w:t>) ADICIONADO como segunda variável preditora. Dado</w:t>
+      </w:r>
+      <w:r>
+        <w:t>: data/</w:t>
+      </w:r>
+      <w:proofErr w:type="spellStart"/>
+      <w:r>
+        <w:t>raw</w:t>
+      </w:r>
+      <w:proofErr w:type="spellEnd"/>
+      <w:r>
+        <w:t>/amm_mensal.csv, cobertura 1948–</w:t>
+      </w:r>
+      <w:proofErr w:type="spellStart"/>
+      <w:r>
+        <w:t>ago</w:t>
+      </w:r>
+      <w:proofErr w:type="spellEnd"/>
+      <w:r>
+        <w:t>/2024.</w:t>
+      </w:r>
+    </w:p>
+    <w:p>
+      <w:r>
+        <w:t>• GPAT (Gradiente Térmico Atlântico Tropical = TNA − TSA) ADICIONADO como substituto operacional do AMM para 2025–2026 (cobertura até dez/2025). Dados: data/</w:t>
+      </w:r>
+      <w:proofErr w:type="spellStart"/>
+      <w:r>
+        <w:t>raw</w:t>
+      </w:r>
+      <w:proofErr w:type="spellEnd"/>
+      <w:r>
+        <w:t>/tna_mensal.csv + data/</w:t>
+      </w:r>
+      <w:proofErr w:type="spellStart"/>
+      <w:r>
+        <w:t>raw</w:t>
+      </w:r>
+      <w:proofErr w:type="spellEnd"/>
+      <w:r>
+        <w:t>/tsa_mensal.csv.</w:t>
+      </w:r>
+    </w:p>
+    <w:p>
+      <w:r>
+        <w:t>•</w:t>
+      </w:r>
+      <w:r>
+        <w:t xml:space="preserve"> Estratégia INMET BDMEP redefinida: dados </w:t>
+      </w:r>
+      <w:proofErr w:type="spellStart"/>
+      <w:r>
+        <w:t>multi-arquivo</w:t>
+      </w:r>
+      <w:proofErr w:type="spellEnd"/>
+      <w:r>
+        <w:t xml:space="preserve"> (um CSV por </w:t>
+      </w:r>
+      <w:proofErr w:type="spellStart"/>
+      <w:r>
+        <w:t>estação×ano</w:t>
+      </w:r>
+      <w:proofErr w:type="spellEnd"/>
+      <w:r>
+        <w:t>). CE: A325 Quixeramobim (2007–2017) + A369 Quixadá (2018–2026). RS: A840 Bento Gonçalves (2006–2012) + A882 Teutônia (2013–2026).</w:t>
       </w:r>
     </w:p>
     <w:p>
@@ -171,12 +456,55 @@
         <w:pStyle w:val="Ttulo2"/>
       </w:pPr>
       <w:r>
-        <w:t>3.1 Visão Geral</w:t>
-      </w:r>
-    </w:p>
-    <w:p>
-      <w:r>
-        <w:t>TODOS OS DADOS COLETADOS E INTEGRADOS. O dataset analítico final (df_mensal) contém 386 registros mensais (2006–2025), dois municípios, com as colunas: Data, Prec_mm, Municipio, Ano, Mes, ONI, Fase_ENSO, AMM, TNA, TSA, GPAT.</w:t>
+        <w:t>3.1 Visão Ge</w:t>
+      </w:r>
+      <w:r>
+        <w:t>ral</w:t>
+      </w:r>
+    </w:p>
+    <w:p>
+      <w:r>
+        <w:t xml:space="preserve">TODOS OS DADOS COLETADOS E INTEGRADOS. O </w:t>
+      </w:r>
+      <w:proofErr w:type="spellStart"/>
+      <w:r>
+        <w:t>dataset</w:t>
+      </w:r>
+      <w:proofErr w:type="spellEnd"/>
+      <w:r>
+        <w:t xml:space="preserve"> analítico final (</w:t>
+      </w:r>
+      <w:proofErr w:type="spellStart"/>
+      <w:r>
+        <w:t>df_mensal</w:t>
+      </w:r>
+      <w:proofErr w:type="spellEnd"/>
+      <w:r>
+        <w:t xml:space="preserve">) contém 386 registros mensais (2006–2025), dois municípios, com as colunas: Data, </w:t>
+      </w:r>
+      <w:proofErr w:type="spellStart"/>
+      <w:r>
+        <w:t>Prec_mm</w:t>
+      </w:r>
+      <w:proofErr w:type="spellEnd"/>
+      <w:r>
+        <w:t xml:space="preserve">, </w:t>
+      </w:r>
+      <w:proofErr w:type="spellStart"/>
+      <w:r>
+        <w:t>Municipio</w:t>
+      </w:r>
+      <w:proofErr w:type="spellEnd"/>
+      <w:r>
+        <w:t xml:space="preserve">, Ano, Mes, ONI, </w:t>
+      </w:r>
+      <w:proofErr w:type="spellStart"/>
+      <w:r>
+        <w:t>Fase_ENSO</w:t>
+      </w:r>
+      <w:proofErr w:type="spellEnd"/>
+      <w:r>
+        <w:t>, AMM, TNA, TSA, GPAT.</w:t>
       </w:r>
     </w:p>
     <w:p>
@@ -197,7 +525,39 @@
     </w:p>
     <w:p>
       <w:r>
-        <w:t>• Arquivo: data/raw/oni_trimestral.csv | sep=";", decimal=",", encoding=utf-8 | Colunas: Year, Period, ONI (já em formato longo).</w:t>
+        <w:t>• Arquivo: data/</w:t>
+      </w:r>
+      <w:proofErr w:type="spellStart"/>
+      <w:r>
+        <w:t>raw</w:t>
+      </w:r>
+      <w:proofErr w:type="spellEnd"/>
+      <w:r>
+        <w:t xml:space="preserve">/oni_trimestral.csv | </w:t>
+      </w:r>
+      <w:proofErr w:type="spellStart"/>
+      <w:r>
+        <w:t>sep</w:t>
+      </w:r>
+      <w:proofErr w:type="spellEnd"/>
+      <w:r>
+        <w:t xml:space="preserve">=";", decimal=",", </w:t>
+      </w:r>
+      <w:proofErr w:type="spellStart"/>
+      <w:r>
+        <w:t>encoding</w:t>
+      </w:r>
+      <w:proofErr w:type="spellEnd"/>
+      <w:r>
+        <w:t xml:space="preserve">=utf-8 | Colunas: Year, </w:t>
+      </w:r>
+      <w:proofErr w:type="spellStart"/>
+      <w:r>
+        <w:t>Period</w:t>
+      </w:r>
+      <w:proofErr w:type="spellEnd"/>
+      <w:r>
+        <w:t>, ONI (já em formato longo).</w:t>
       </w:r>
     </w:p>
     <w:p>
@@ -210,12 +570,31 @@
         <w:pStyle w:val="Ttulo3"/>
       </w:pPr>
       <w:r>
-        <w:t>3.2.2 TSM Mensal Niño 3.4 (NOAA/CPC)</w:t>
-      </w:r>
-    </w:p>
-    <w:p>
-      <w:r>
-        <w:t>• Arquivo: data/raw/tsm_nino34_mensal.csv | Série mensal para cálculo de derivadas (Seção 7). STATUS: COLETADO.</w:t>
+        <w:t xml:space="preserve">3.2.2 TSM Mensal </w:t>
+      </w:r>
+      <w:proofErr w:type="spellStart"/>
+      <w:r>
+        <w:t>Niño</w:t>
+      </w:r>
+      <w:proofErr w:type="spellEnd"/>
+      <w:r>
+        <w:t xml:space="preserve"> 3.4 (NOAA/CPC)</w:t>
+      </w:r>
+    </w:p>
+    <w:p>
+      <w:r>
+        <w:t>• A</w:t>
+      </w:r>
+      <w:r>
+        <w:t>rquivo: data/</w:t>
+      </w:r>
+      <w:proofErr w:type="spellStart"/>
+      <w:r>
+        <w:t>raw</w:t>
+      </w:r>
+      <w:proofErr w:type="spellEnd"/>
+      <w:r>
+        <w:t>/tsm_nino34_mensal.csv | Série mensal para cálculo de derivadas (Seção 7). STATUS: COLETADO.</w:t>
       </w:r>
     </w:p>
     <w:p>
@@ -223,27 +602,129 @@
         <w:pStyle w:val="Ttulo3"/>
       </w:pPr>
       <w:r>
-        <w:t>3.2.3 AMM — Atlantic Meridional Mode (NOAA/PSL)</w:t>
-      </w:r>
-    </w:p>
-    <w:p>
-      <w:r>
-        <w:t>• Arquivo: data/raw/amm_mensal.csv | sep=";", decimal=".", encoding=utf-8 | Colunas: Data, Ano, Mes, AMM.</w:t>
-      </w:r>
-    </w:p>
-    <w:p>
-      <w:r>
-        <w:t>• Cobertura: 1948-01 a 2024-08 (921 registros). Meses após ago/2024 ficam NaN no merge.</w:t>
-      </w:r>
-    </w:p>
-    <w:p>
-      <w:r>
-        <w:t>• Interpretação: AMM &gt; 0 = ZCIT deslocada para sul = mais chuva no NE (atenua seca do El Niño). AMM em fev/2024 atingiu +4,02 — explicação para chuvas recordes no Sertão com El Niño ativo.</w:t>
-      </w:r>
-    </w:p>
-    <w:p>
-      <w:r>
-        <w:t>• STATUS: COLETADO E INTEGRADO. Usado na regressão (lag=1) e análise de quadrantes (lag=5).</w:t>
+        <w:t xml:space="preserve">3.2.3 AMM — </w:t>
+      </w:r>
+      <w:proofErr w:type="spellStart"/>
+      <w:r>
+        <w:t>Atlantic</w:t>
+      </w:r>
+      <w:proofErr w:type="spellEnd"/>
+      <w:r>
+        <w:t xml:space="preserve"> Meridional </w:t>
+      </w:r>
+      <w:proofErr w:type="spellStart"/>
+      <w:r>
+        <w:t>Mode</w:t>
+      </w:r>
+      <w:proofErr w:type="spellEnd"/>
+      <w:r>
+        <w:t xml:space="preserve"> (NOAA/PSL)</w:t>
+      </w:r>
+    </w:p>
+    <w:p>
+      <w:r>
+        <w:t>• Arquivo: data/</w:t>
+      </w:r>
+      <w:proofErr w:type="spellStart"/>
+      <w:r>
+        <w:t>raw</w:t>
+      </w:r>
+      <w:proofErr w:type="spellEnd"/>
+      <w:r>
+        <w:t xml:space="preserve">/amm_mensal.csv | </w:t>
+      </w:r>
+      <w:proofErr w:type="spellStart"/>
+      <w:r>
+        <w:t>sep</w:t>
+      </w:r>
+      <w:proofErr w:type="spellEnd"/>
+      <w:r>
+        <w:t xml:space="preserve">=";", decimal=".", </w:t>
+      </w:r>
+      <w:proofErr w:type="spellStart"/>
+      <w:r>
+        <w:t>encoding</w:t>
+      </w:r>
+      <w:proofErr w:type="spellEnd"/>
+      <w:r>
+        <w:t>=utf-8 | Colunas: Data, Ano, Mes</w:t>
+      </w:r>
+      <w:r>
+        <w:t>, AMM.</w:t>
+      </w:r>
+    </w:p>
+    <w:p>
+      <w:r>
+        <w:t xml:space="preserve">• Cobertura: 1948-01 a 2024-08 (921 registros). Meses após </w:t>
+      </w:r>
+      <w:proofErr w:type="spellStart"/>
+      <w:r>
+        <w:t>ago</w:t>
+      </w:r>
+      <w:proofErr w:type="spellEnd"/>
+      <w:r>
+        <w:t xml:space="preserve">/2024 ficam </w:t>
+      </w:r>
+      <w:proofErr w:type="spellStart"/>
+      <w:r>
+        <w:t>NaN</w:t>
+      </w:r>
+      <w:proofErr w:type="spellEnd"/>
+      <w:r>
+        <w:t xml:space="preserve"> no merge.</w:t>
+      </w:r>
+    </w:p>
+    <w:p>
+      <w:r>
+        <w:t xml:space="preserve">• Interpretação: AMM &gt; 0 = ZCIT deslocada para sul = mais chuva no NE (atenua seca do El </w:t>
+      </w:r>
+      <w:proofErr w:type="spellStart"/>
+      <w:r>
+        <w:t>Niño</w:t>
+      </w:r>
+      <w:proofErr w:type="spellEnd"/>
+      <w:r>
+        <w:t xml:space="preserve">). AMM em </w:t>
+      </w:r>
+      <w:proofErr w:type="spellStart"/>
+      <w:r>
+        <w:t>fev</w:t>
+      </w:r>
+      <w:proofErr w:type="spellEnd"/>
+      <w:r>
+        <w:t>/2024 atingiu +4,02 — explicação para chuvas recordes n</w:t>
+      </w:r>
+      <w:r>
+        <w:t xml:space="preserve">o Sertão com El </w:t>
+      </w:r>
+      <w:proofErr w:type="spellStart"/>
+      <w:r>
+        <w:t>Niño</w:t>
+      </w:r>
+      <w:proofErr w:type="spellEnd"/>
+      <w:r>
+        <w:t xml:space="preserve"> ativo.</w:t>
+      </w:r>
+    </w:p>
+    <w:p>
+      <w:r>
+        <w:t>• STATUS: COLETADO E INTEGRADO. Usado na regressão (</w:t>
+      </w:r>
+      <w:proofErr w:type="spellStart"/>
+      <w:r>
+        <w:t>lag</w:t>
+      </w:r>
+      <w:proofErr w:type="spellEnd"/>
+      <w:r>
+        <w:t>=1) e análise de quadrantes (</w:t>
+      </w:r>
+      <w:proofErr w:type="spellStart"/>
+      <w:r>
+        <w:t>lag</w:t>
+      </w:r>
+      <w:proofErr w:type="spellEnd"/>
+      <w:r>
+        <w:t>=5).</w:t>
       </w:r>
     </w:p>
     <w:p>
@@ -256,21 +737,76 @@
     </w:p>
     <w:p>
       <w:r>
-        <w:t>• Arquivos: data/raw/tna_mensal.csv e data/raw/tsa_mensal.csv | sep=";", decimal=".", encoding=utf-8.</w:t>
-      </w:r>
-    </w:p>
-    <w:p>
-      <w:r>
-        <w:t>• Cobertura: 1948-01 a 2025-12 (936 registros cada). Zero NaNs. Cobre 16 meses além do AMM.</w:t>
-      </w:r>
-    </w:p>
-    <w:p>
-      <w:r>
-        <w:t>• Interpretação: GPAT &gt; 0 = Atlântico Norte mais quente = ZCIT para norte = menos chuva no NE (reforça seca do El Niño). Sinal oposto ao AMM, mesmo mecanismo físico.</w:t>
-      </w:r>
-    </w:p>
-    <w:p>
-      <w:r>
+        <w:t>• Arquivos: data/</w:t>
+      </w:r>
+      <w:proofErr w:type="spellStart"/>
+      <w:r>
+        <w:t>raw</w:t>
+      </w:r>
+      <w:proofErr w:type="spellEnd"/>
+      <w:r>
+        <w:t>/tna_mensal.csv e data/</w:t>
+      </w:r>
+      <w:proofErr w:type="spellStart"/>
+      <w:r>
+        <w:t>raw</w:t>
+      </w:r>
+      <w:proofErr w:type="spellEnd"/>
+      <w:r>
+        <w:t xml:space="preserve">/tsa_mensal.csv | </w:t>
+      </w:r>
+      <w:proofErr w:type="spellStart"/>
+      <w:r>
+        <w:t>sep</w:t>
+      </w:r>
+      <w:proofErr w:type="spellEnd"/>
+      <w:r>
+        <w:t>=";", d</w:t>
+      </w:r>
+      <w:r>
+        <w:t xml:space="preserve">ecimal=".", </w:t>
+      </w:r>
+      <w:proofErr w:type="spellStart"/>
+      <w:r>
+        <w:t>encoding</w:t>
+      </w:r>
+      <w:proofErr w:type="spellEnd"/>
+      <w:r>
+        <w:t>=utf-8.</w:t>
+      </w:r>
+    </w:p>
+    <w:p>
+      <w:r>
+        <w:t xml:space="preserve">• Cobertura: 1948-01 a 2025-12 (936 registros cada). Zero </w:t>
+      </w:r>
+      <w:proofErr w:type="spellStart"/>
+      <w:r>
+        <w:t>NaNs</w:t>
+      </w:r>
+      <w:proofErr w:type="spellEnd"/>
+      <w:r>
+        <w:t>. Cobre 16 meses além do AMM.</w:t>
+      </w:r>
+    </w:p>
+    <w:p>
+      <w:r>
+        <w:t xml:space="preserve">• Interpretação: GPAT &gt; 0 = Atlântico Norte mais quente = ZCIT para norte = menos chuva no NE (reforça seca do El </w:t>
+      </w:r>
+      <w:proofErr w:type="spellStart"/>
+      <w:r>
+        <w:t>Niño</w:t>
+      </w:r>
+      <w:proofErr w:type="spellEnd"/>
+      <w:r>
+        <w:t>). Sinal oposto ao</w:t>
+      </w:r>
+      <w:r>
+        <w:t xml:space="preserve"> AMM, mesmo mecanismo físico.</w:t>
+      </w:r>
+    </w:p>
+    <w:p>
+      <w:r>
+        <w:lastRenderedPageBreak/>
         <w:t>• GPAT dez/2025 = 0,10 (quase neutro). Usado como índice atlântico operacional no score 2026. STATUS: COLETADO E INTEGRADO.</w:t>
       </w:r>
     </w:p>
@@ -284,7 +820,34 @@
     </w:p>
     <w:p>
       <w:r>
-        <w:t>• Arquivo: data/raw/producao_agricola.csv | encoding=utf-8, skiprows=2 | Colunas: Variável | Ano | Produto | Quixadá (CE) | Lajeado (RS). STATUS: COLETADO E INTEGRADO.</w:t>
+        <w:t>• Arquivo: data/</w:t>
+      </w:r>
+      <w:proofErr w:type="spellStart"/>
+      <w:r>
+        <w:t>raw</w:t>
+      </w:r>
+      <w:proofErr w:type="spellEnd"/>
+      <w:r>
+        <w:t xml:space="preserve">/producao_agricola.csv | </w:t>
+      </w:r>
+      <w:proofErr w:type="spellStart"/>
+      <w:r>
+        <w:t>encoding</w:t>
+      </w:r>
+      <w:proofErr w:type="spellEnd"/>
+      <w:r>
+        <w:t>=utf-</w:t>
+      </w:r>
+      <w:r>
+        <w:t xml:space="preserve">8, </w:t>
+      </w:r>
+      <w:proofErr w:type="spellStart"/>
+      <w:r>
+        <w:t>skiprows</w:t>
+      </w:r>
+      <w:proofErr w:type="spellEnd"/>
+      <w:r>
+        <w:t>=2 | Colunas: Variável | Ano | Produto | Quixadá (CE) | Lajeado (RS). STATUS: COLETADO E INTEGRADO.</w:t>
       </w:r>
     </w:p>
     <w:p>
@@ -297,7 +860,50 @@
     </w:p>
     <w:p>
       <w:r>
-        <w:t>• Arquivos: data/raw/decretos_ce.csv e data/raw/decretos_rs.csv | encoding=utf-8, sep=";" | Data do Decreto em dd/mm/YYYY. STATUS: COLETADO E INTEGRADO.</w:t>
+        <w:t>• Arquivos: data/</w:t>
+      </w:r>
+      <w:proofErr w:type="spellStart"/>
+      <w:r>
+        <w:t>raw</w:t>
+      </w:r>
+      <w:proofErr w:type="spellEnd"/>
+      <w:r>
+        <w:t>/decretos_ce.csv e data/</w:t>
+      </w:r>
+      <w:proofErr w:type="spellStart"/>
+      <w:r>
+        <w:t>raw</w:t>
+      </w:r>
+      <w:proofErr w:type="spellEnd"/>
+      <w:r>
+        <w:t xml:space="preserve">/decretos_rs.csv | </w:t>
+      </w:r>
+      <w:proofErr w:type="spellStart"/>
+      <w:r>
+        <w:t>encoding</w:t>
+      </w:r>
+      <w:proofErr w:type="spellEnd"/>
+      <w:r>
+        <w:t xml:space="preserve">=utf-8, </w:t>
+      </w:r>
+      <w:proofErr w:type="spellStart"/>
+      <w:r>
+        <w:t>sep</w:t>
+      </w:r>
+      <w:proofErr w:type="spellEnd"/>
+      <w:r>
+        <w:t>=";" | Data do Dec</w:t>
+      </w:r>
+      <w:r>
+        <w:t xml:space="preserve">reto em </w:t>
+      </w:r>
+      <w:proofErr w:type="spellStart"/>
+      <w:r>
+        <w:t>dd</w:t>
+      </w:r>
+      <w:proofErr w:type="spellEnd"/>
+      <w:r>
+        <w:t>/mm/YYYY. STATUS: COLETADO E INTEGRADO.</w:t>
       </w:r>
     </w:p>
     <w:p>
@@ -310,12 +916,87 @@
     </w:p>
     <w:p>
       <w:r>
-        <w:t>• Multi-arquivo: um CSV por estação×ano | encoding=latin-1, sep=";", decimal=",", skiprows=8 | Sentinel -9999 = NaN.</w:t>
-      </w:r>
-    </w:p>
-    <w:p>
-      <w:r>
-        <w:t>• CE: A325 Quixeramobim (2007–2017) + A369 Quixadá (2018–2026). A369 inicia em mar/2018 (jan–fev ausentes).</w:t>
+        <w:t xml:space="preserve">• </w:t>
+      </w:r>
+      <w:proofErr w:type="spellStart"/>
+      <w:r>
+        <w:t>Multi-arquivo</w:t>
+      </w:r>
+      <w:proofErr w:type="spellEnd"/>
+      <w:r>
+        <w:t xml:space="preserve">: um CSV por </w:t>
+      </w:r>
+      <w:proofErr w:type="spellStart"/>
+      <w:r>
+        <w:t>estação×ano</w:t>
+      </w:r>
+      <w:proofErr w:type="spellEnd"/>
+      <w:r>
+        <w:t xml:space="preserve"> | </w:t>
+      </w:r>
+      <w:proofErr w:type="spellStart"/>
+      <w:r>
+        <w:t>encoding</w:t>
+      </w:r>
+      <w:proofErr w:type="spellEnd"/>
+      <w:r>
+        <w:t xml:space="preserve">=latin-1, </w:t>
+      </w:r>
+      <w:proofErr w:type="spellStart"/>
+      <w:r>
+        <w:t>sep</w:t>
+      </w:r>
+      <w:proofErr w:type="spellEnd"/>
+      <w:r>
+        <w:t xml:space="preserve">=";", decimal=",", </w:t>
+      </w:r>
+      <w:proofErr w:type="spellStart"/>
+      <w:r>
+        <w:t>skiprows</w:t>
+      </w:r>
+      <w:proofErr w:type="spellEnd"/>
+      <w:r>
+        <w:t xml:space="preserve">=8 | </w:t>
+      </w:r>
+      <w:proofErr w:type="spellStart"/>
+      <w:r>
+        <w:t>Sentinel</w:t>
+      </w:r>
+      <w:proofErr w:type="spellEnd"/>
+      <w:r>
+        <w:t xml:space="preserve"> -9999 = </w:t>
+      </w:r>
+      <w:proofErr w:type="spellStart"/>
+      <w:r>
+        <w:t>NaN</w:t>
+      </w:r>
+      <w:proofErr w:type="spellEnd"/>
+      <w:r>
+        <w:t>.</w:t>
+      </w:r>
+    </w:p>
+    <w:p>
+      <w:r>
+        <w:t xml:space="preserve">• CE: A325 Quixeramobim (2007–2017) + A369 </w:t>
+      </w:r>
+      <w:r>
+        <w:t>Quixadá (2018–2026). A369 inicia em mar/2018 (</w:t>
+      </w:r>
+      <w:proofErr w:type="spellStart"/>
+      <w:r>
+        <w:t>jan</w:t>
+      </w:r>
+      <w:proofErr w:type="spellEnd"/>
+      <w:r>
+        <w:t>–</w:t>
+      </w:r>
+      <w:proofErr w:type="spellStart"/>
+      <w:r>
+        <w:t>fev</w:t>
+      </w:r>
+      <w:proofErr w:type="spellEnd"/>
+      <w:r>
+        <w:t xml:space="preserve"> ausentes).</w:t>
       </w:r>
     </w:p>
     <w:p>
@@ -325,7 +1006,15 @@
     </w:p>
     <w:p>
       <w:r>
-        <w:t>• Agregação: horário → mensal (soma). Winsorização P1–P99 aplicada. STATUS: COLETADO, PROCESSADO E INTEGRADO.</w:t>
+        <w:t xml:space="preserve">• Agregação: horário → mensal (soma). </w:t>
+      </w:r>
+      <w:proofErr w:type="spellStart"/>
+      <w:r>
+        <w:t>Winsorização</w:t>
+      </w:r>
+      <w:proofErr w:type="spellEnd"/>
+      <w:r>
+        <w:t xml:space="preserve"> P1–P99 aplicada. STATUS: COLETADO, PROCESSADO E INTEGRADO.</w:t>
       </w:r>
     </w:p>
     <w:p>
@@ -333,17 +1022,44 @@
         <w:pStyle w:val="Ttulo1"/>
       </w:pPr>
       <w:r>
-        <w:t>4. Estrutura do Notebook — Estado Atual</w:t>
-      </w:r>
-    </w:p>
-    <w:p>
-      <w:r>
-        <w:t>Arquivo: SENSO_notebook_rascunho.ipynb | 58 células (34 código + 24 markdown) | 9 seções | Executado do início ao fim sem erros.</w:t>
-      </w:r>
-    </w:p>
-    <w:p>
-      <w:r>
-        <w:t>Os 4 pontos de preenchimento manual do plano original foram todos resolvidos automaticamente a partir dos resultados reais das células anteriores.</w:t>
+        <w:t xml:space="preserve">4. Estrutura </w:t>
+      </w:r>
+      <w:r>
+        <w:t>do Notebook — Estado Atual</w:t>
+      </w:r>
+    </w:p>
+    <w:p>
+      <w:r>
+        <w:t xml:space="preserve">Arquivo: </w:t>
+      </w:r>
+      <w:proofErr w:type="spellStart"/>
+      <w:r>
+        <w:t>SENSO_notebook_</w:t>
+      </w:r>
+      <w:proofErr w:type="gramStart"/>
+      <w:r>
+        <w:t>rascunho.ipynb</w:t>
+      </w:r>
+      <w:proofErr w:type="spellEnd"/>
+      <w:proofErr w:type="gramEnd"/>
+      <w:r>
+        <w:t xml:space="preserve"> | 58 células (34 código + 24 </w:t>
+      </w:r>
+      <w:proofErr w:type="spellStart"/>
+      <w:r>
+        <w:t>markdown</w:t>
+      </w:r>
+      <w:proofErr w:type="spellEnd"/>
+      <w:r>
+        <w:t>) | 9 seções | Executado do início ao fim sem erros.</w:t>
+      </w:r>
+    </w:p>
+    <w:p>
+      <w:r>
+        <w:t xml:space="preserve">Os 4 pontos de preenchimento manual do plano original foram todos resolvidos </w:t>
+      </w:r>
+      <w:r>
+        <w:t>automaticamente a partir dos resultados reais das células anteriores.</w:t>
       </w:r>
     </w:p>
     <w:p>
@@ -356,32 +1072,134 @@
     </w:p>
     <w:p>
       <w:r>
-        <w:t>• Seção 1: Configuração do ambiente (seed=42, imports, mkdir figuras/)</w:t>
-      </w:r>
-    </w:p>
-    <w:p>
-      <w:r>
-        <w:t>• Seção 2: Carregamento de dados — 8 fontes (2.1 ONI, 2.2 fase ENSO, 2.3 TSM, 2.4 INMET, 2.5 produção, 2.6 decretos, 2.7 AMM, 2.8 GPAT/TNA/TSA)</w:t>
-      </w:r>
-    </w:p>
-    <w:p>
-      <w:r>
-        <w:t>• Seção 3: Limpeza e criação do dataset integrado (df_mensal, 386 registros, winsorização, merge AMM e GPAT)</w:t>
-      </w:r>
-    </w:p>
-    <w:p>
-      <w:r>
-        <w:t>• Seção 4: Estatística descritiva (boxplots por fase ENSO, sazonalidade)</w:t>
-      </w:r>
-    </w:p>
-    <w:p>
-      <w:r>
-        <w:t>• Seção 5: Amostragem estratificada por fase ENSO (KS validado p=1,00)</w:t>
-      </w:r>
-    </w:p>
-    <w:p>
-      <w:r>
-        <w:t>• Seção 6: Análise inferencial (6.1 lag correlation, 6.2 Mann-Whitney, 6.3 regressão múltipla OLS, 6.4 AMM×precipitação + quadrantes ONI×AMM + correlação GPAT)</w:t>
+        <w:t>• Seção 1: Configuração do ambiente (</w:t>
+      </w:r>
+      <w:proofErr w:type="spellStart"/>
+      <w:r>
+        <w:t>seed</w:t>
+      </w:r>
+      <w:proofErr w:type="spellEnd"/>
+      <w:r>
+        <w:t xml:space="preserve">=42, </w:t>
+      </w:r>
+      <w:proofErr w:type="spellStart"/>
+      <w:r>
+        <w:t>imports</w:t>
+      </w:r>
+      <w:proofErr w:type="spellEnd"/>
+      <w:r>
+        <w:t xml:space="preserve">, </w:t>
+      </w:r>
+      <w:proofErr w:type="spellStart"/>
+      <w:r>
+        <w:t>mkdir</w:t>
+      </w:r>
+      <w:proofErr w:type="spellEnd"/>
+      <w:r>
+        <w:t xml:space="preserve"> figuras/)</w:t>
+      </w:r>
+    </w:p>
+    <w:p>
+      <w:r>
+        <w:t xml:space="preserve">• Seção 2: Carregamento de dados — 8 fontes (2.1 ONI, </w:t>
+      </w:r>
+      <w:proofErr w:type="gramStart"/>
+      <w:r>
+        <w:t>2.2 fase</w:t>
+      </w:r>
+      <w:proofErr w:type="gramEnd"/>
+      <w:r>
+        <w:t xml:space="preserve"> ENSO, 2.3 TSM, 2.4 INMET,</w:t>
+      </w:r>
+      <w:r>
+        <w:t xml:space="preserve"> 2.5 produção, 2.6 decretos, 2.7 AMM, 2.8 GPAT/TNA/TSA)</w:t>
+      </w:r>
+    </w:p>
+    <w:p>
+      <w:r>
+        <w:t xml:space="preserve">• Seção 3: Limpeza e criação do </w:t>
+      </w:r>
+      <w:proofErr w:type="spellStart"/>
+      <w:r>
+        <w:t>dataset</w:t>
+      </w:r>
+      <w:proofErr w:type="spellEnd"/>
+      <w:r>
+        <w:t xml:space="preserve"> integrado (</w:t>
+      </w:r>
+      <w:proofErr w:type="spellStart"/>
+      <w:r>
+        <w:t>df_mensal</w:t>
+      </w:r>
+      <w:proofErr w:type="spellEnd"/>
+      <w:r>
+        <w:t xml:space="preserve">, 386 registros, </w:t>
+      </w:r>
+      <w:proofErr w:type="spellStart"/>
+      <w:r>
+        <w:t>winsorização</w:t>
+      </w:r>
+      <w:proofErr w:type="spellEnd"/>
+      <w:r>
+        <w:t>, merge AMM e GPAT)</w:t>
+      </w:r>
+    </w:p>
+    <w:p>
+      <w:r>
+        <w:t>• Seção 4: Estatística descritiva (</w:t>
+      </w:r>
+      <w:proofErr w:type="spellStart"/>
+      <w:r>
+        <w:t>boxplots</w:t>
+      </w:r>
+      <w:proofErr w:type="spellEnd"/>
+      <w:r>
+        <w:t xml:space="preserve"> por fase ENSO, sazonalidade)</w:t>
+      </w:r>
+    </w:p>
+    <w:p>
+      <w:r>
+        <w:t>• Seção 5: Amostra</w:t>
+      </w:r>
+      <w:r>
+        <w:t>gem estratificada por fase ENSO (KS validado p=1,00)</w:t>
+      </w:r>
+    </w:p>
+    <w:p>
+      <w:r>
+        <w:t xml:space="preserve">• Seção 6: Análise inferencial (6.1 </w:t>
+      </w:r>
+      <w:proofErr w:type="spellStart"/>
+      <w:r>
+        <w:t>lag</w:t>
+      </w:r>
+      <w:proofErr w:type="spellEnd"/>
+      <w:r>
+        <w:t xml:space="preserve"> </w:t>
+      </w:r>
+      <w:proofErr w:type="spellStart"/>
+      <w:r>
+        <w:t>correlation</w:t>
+      </w:r>
+      <w:proofErr w:type="spellEnd"/>
+      <w:r>
+        <w:t xml:space="preserve">, 6.2 Mann-Whitney, </w:t>
+      </w:r>
+      <w:proofErr w:type="gramStart"/>
+      <w:r>
+        <w:t>6.3 regressão</w:t>
+      </w:r>
+      <w:proofErr w:type="gramEnd"/>
+      <w:r>
+        <w:t xml:space="preserve"> múltipla OLS, 6.4 </w:t>
+      </w:r>
+      <w:proofErr w:type="spellStart"/>
+      <w:r>
+        <w:t>AMM×precipitação</w:t>
+      </w:r>
+      <w:proofErr w:type="spellEnd"/>
+      <w:r>
+        <w:t xml:space="preserve"> + quadrantes ONI×AMM + correlação GPAT)</w:t>
       </w:r>
     </w:p>
     <w:p>
@@ -391,7 +1209,34 @@
     </w:p>
     <w:p>
       <w:r>
-        <w:t>• Seção 8: Score de risco S.ENSO (função, aplicação maio/2026 e projeção jun–nov/2026)</w:t>
+        <w:t>• S</w:t>
+      </w:r>
+      <w:r>
+        <w:t xml:space="preserve">eção 8: Score de risco </w:t>
+      </w:r>
+      <w:proofErr w:type="gramStart"/>
+      <w:r>
+        <w:t>S.ENSO</w:t>
+      </w:r>
+      <w:proofErr w:type="gramEnd"/>
+      <w:r>
+        <w:t xml:space="preserve"> (função, aplicação maio/2026 e projeção </w:t>
+      </w:r>
+      <w:proofErr w:type="spellStart"/>
+      <w:r>
+        <w:t>jun</w:t>
+      </w:r>
+      <w:proofErr w:type="spellEnd"/>
+      <w:r>
+        <w:t>–</w:t>
+      </w:r>
+      <w:proofErr w:type="spellStart"/>
+      <w:r>
+        <w:t>nov</w:t>
+      </w:r>
+      <w:proofErr w:type="spellEnd"/>
+      <w:r>
+        <w:t>/2026)</w:t>
       </w:r>
     </w:p>
     <w:p>
@@ -417,17 +1262,52 @@
     </w:p>
     <w:p>
       <w:r>
-        <w:t>• Quixadá-CE: mediana = 16,4 mm/mês em El Niño vs. 23,6 mm em Neutro (−30,5%).</w:t>
-      </w:r>
-    </w:p>
-    <w:p>
-      <w:r>
-        <w:t>• Lajeado-RS: mediana = 153,3 mm em El Niño vs. 132,7 mm em Neutro (+15,5%).</w:t>
-      </w:r>
-    </w:p>
-    <w:p>
-      <w:r>
-        <w:t>• La Niña reverte o padrão em ambos — confirma assimetria geográfica do ENSO no Brasil.</w:t>
+        <w:t>• Quixadá-CE: mediana =</w:t>
+      </w:r>
+      <w:r>
+        <w:t xml:space="preserve"> 16,4 mm/mês em El </w:t>
+      </w:r>
+      <w:proofErr w:type="spellStart"/>
+      <w:r>
+        <w:t>Niño</w:t>
+      </w:r>
+      <w:proofErr w:type="spellEnd"/>
+      <w:r>
+        <w:t xml:space="preserve"> vs. 23,6 mm em Neutro (−30,5%).</w:t>
+      </w:r>
+    </w:p>
+    <w:p>
+      <w:r>
+        <w:t xml:space="preserve">• </w:t>
+      </w:r>
+      <w:proofErr w:type="spellStart"/>
+      <w:r>
+        <w:t>Lajeado-RS</w:t>
+      </w:r>
+      <w:proofErr w:type="spellEnd"/>
+      <w:r>
+        <w:t xml:space="preserve">: mediana = 153,3 mm em El </w:t>
+      </w:r>
+      <w:proofErr w:type="spellStart"/>
+      <w:r>
+        <w:t>Niño</w:t>
+      </w:r>
+      <w:proofErr w:type="spellEnd"/>
+      <w:r>
+        <w:t xml:space="preserve"> vs. 132,7 mm em Neutro (+15,5%).</w:t>
+      </w:r>
+    </w:p>
+    <w:p>
+      <w:r>
+        <w:t xml:space="preserve">• La </w:t>
+      </w:r>
+      <w:proofErr w:type="spellStart"/>
+      <w:r>
+        <w:t>Niña</w:t>
+      </w:r>
+      <w:proofErr w:type="spellEnd"/>
+      <w:r>
+        <w:t xml:space="preserve"> reverte o padrão em ambos — confirma assimetria geográfica do ENSO no Brasil.</w:t>
       </w:r>
     </w:p>
     <w:p>
@@ -435,17 +1315,37 @@
         <w:pStyle w:val="Ttulo2"/>
       </w:pPr>
       <w:r>
-        <w:t>5.2 Amostragem Estratificada (Seção 5)</w:t>
-      </w:r>
-    </w:p>
-    <w:p>
-      <w:r>
-        <w:t>• KS-test: D &lt; 0,030, p = 1,00 para ambos os municípios. Distribuição amostral validação.</w:t>
-      </w:r>
-    </w:p>
-    <w:p>
-      <w:r>
-        <w:t>• Anos Neutros = 41,7% da série; El Niño Forte = apenas 4,7% — estratificação necessária.</w:t>
+        <w:t>5.2 Amostragem Estratificada (Seção</w:t>
+      </w:r>
+      <w:r>
+        <w:t xml:space="preserve"> 5)</w:t>
+      </w:r>
+    </w:p>
+    <w:p>
+      <w:r>
+        <w:t>• KS-</w:t>
+      </w:r>
+      <w:proofErr w:type="spellStart"/>
+      <w:r>
+        <w:t>test</w:t>
+      </w:r>
+      <w:proofErr w:type="spellEnd"/>
+      <w:r>
+        <w:t>: D &lt; 0,030, p = 1,00 para ambos os municípios. Distribuição amostral validação.</w:t>
+      </w:r>
+    </w:p>
+    <w:p>
+      <w:r>
+        <w:lastRenderedPageBreak/>
+        <w:t xml:space="preserve">• Anos Neutros = 41,7% da série; El </w:t>
+      </w:r>
+      <w:proofErr w:type="spellStart"/>
+      <w:r>
+        <w:t>Niño</w:t>
+      </w:r>
+      <w:proofErr w:type="spellEnd"/>
+      <w:r>
+        <w:t xml:space="preserve"> Forte = apenas 4,7% — estratificação necessária.</w:t>
       </w:r>
     </w:p>
     <w:p>
@@ -453,35 +1353,140 @@
         <w:pStyle w:val="Ttulo2"/>
       </w:pPr>
       <w:r>
-        <w:t>5.3 Correlação de Lag ONI × Precipitação (Seção 6.1)</w:t>
-      </w:r>
-    </w:p>
-    <w:p>
-      <w:r>
-        <w:t>• Lajeado-RS: lag ótimo = 0 meses | r = 0,291 | p &lt; 0,0001.</w:t>
-      </w:r>
-    </w:p>
-    <w:p>
-      <w:r>
-        <w:t>• Quixadá-CE: nenhum lag significativo com ONI isolado (0–12 meses). Mediação pelo Atlântico explica a ausência de sinal — confirmada na seção 6.4.</w:t>
+        <w:t xml:space="preserve">5.3 Correlação de </w:t>
+      </w:r>
+      <w:proofErr w:type="spellStart"/>
+      <w:r>
+        <w:t>Lag</w:t>
+      </w:r>
+      <w:proofErr w:type="spellEnd"/>
+      <w:r>
+        <w:t xml:space="preserve"> ONI × Precipitação (Seção 6.1)</w:t>
+      </w:r>
+    </w:p>
+    <w:p>
+      <w:r>
+        <w:t xml:space="preserve">• </w:t>
+      </w:r>
+      <w:proofErr w:type="spellStart"/>
+      <w:r>
+        <w:t>Lajeado-RS</w:t>
+      </w:r>
+      <w:proofErr w:type="spellEnd"/>
+      <w:r>
+        <w:t xml:space="preserve">: </w:t>
+      </w:r>
+      <w:proofErr w:type="spellStart"/>
+      <w:r>
+        <w:t>lag</w:t>
+      </w:r>
+      <w:proofErr w:type="spellEnd"/>
+      <w:r>
+        <w:t xml:space="preserve"> ó</w:t>
+      </w:r>
+      <w:r>
+        <w:t>timo = 0 meses | r = 0,291 | p &lt; 0,0001.</w:t>
+      </w:r>
+    </w:p>
+    <w:p>
+      <w:r>
+        <w:t xml:space="preserve">• Quixadá-CE: nenhum </w:t>
+      </w:r>
+      <w:proofErr w:type="spellStart"/>
+      <w:r>
+        <w:t>lag</w:t>
+      </w:r>
+      <w:proofErr w:type="spellEnd"/>
+      <w:r>
+        <w:t xml:space="preserve"> significativo com ONI isolado (0–12 meses). Mediação pelo Atlântico explica a ausência de sinal — confirmada na seção 6.4.</w:t>
       </w:r>
     </w:p>
     <w:p>
       <w:pPr>
         <w:pStyle w:val="Ttulo2"/>
-      </w:pPr>
-      <w:r>
-        <w:t>5.4 Mann-Whitney (Seção 6.2)</w:t>
-      </w:r>
-    </w:p>
-    <w:p>
-      <w:r>
-        <w:t>• Lajeado-RS: U = 850,5, p = 0,0064. El Niño Forte/Super = 206,6 mm vs. 132,7 mm Neutro (+55,7%). Diferença significativa.</w:t>
-      </w:r>
-    </w:p>
-    <w:p>
-      <w:r>
-        <w:t>• Quixadá-CE: p = 0,2706. Sem evidência suficiente para rejeitar H₀ quando El Niños são agrupados sem controle do AMM. El Niño + AMM+ cancela a seca, diluindo o efeito médio do grupo.</w:t>
+        <w:rPr>
+          <w:lang w:val="en-US"/>
+        </w:rPr>
+      </w:pPr>
+      <w:r>
+        <w:rPr>
+          <w:lang w:val="en-US"/>
+        </w:rPr>
+        <w:t>5.4 Mann-Whitney (</w:t>
+      </w:r>
+      <w:proofErr w:type="spellStart"/>
+      <w:r>
+        <w:rPr>
+          <w:lang w:val="en-US"/>
+        </w:rPr>
+        <w:t>Seção</w:t>
+      </w:r>
+      <w:proofErr w:type="spellEnd"/>
+      <w:r>
+        <w:rPr>
+          <w:lang w:val="en-US"/>
+        </w:rPr>
+        <w:t xml:space="preserve"> 6.2)</w:t>
+      </w:r>
+    </w:p>
+    <w:p>
+      <w:r>
+        <w:rPr>
+          <w:lang w:val="en-US"/>
+        </w:rPr>
+        <w:t xml:space="preserve">• </w:t>
+      </w:r>
+      <w:proofErr w:type="spellStart"/>
+      <w:r>
+        <w:rPr>
+          <w:lang w:val="en-US"/>
+        </w:rPr>
+        <w:t>Lajeado</w:t>
+      </w:r>
+      <w:proofErr w:type="spellEnd"/>
+      <w:r>
+        <w:rPr>
+          <w:lang w:val="en-US"/>
+        </w:rPr>
+        <w:t xml:space="preserve">-RS: U = 850,5, p = 0,0064. </w:t>
+      </w:r>
+      <w:r>
+        <w:t>E</w:t>
+      </w:r>
+      <w:r>
+        <w:t xml:space="preserve">l </w:t>
+      </w:r>
+      <w:proofErr w:type="spellStart"/>
+      <w:r>
+        <w:t>Niño</w:t>
+      </w:r>
+      <w:proofErr w:type="spellEnd"/>
+      <w:r>
+        <w:t xml:space="preserve"> Forte/Super = 206,6 mm vs. 132,7 mm Neutro (+55,7%). Diferença significativa.</w:t>
+      </w:r>
+    </w:p>
+    <w:p>
+      <w:r>
+        <w:t xml:space="preserve">• Quixadá-CE: p = 0,2706. Sem evidência suficiente para rejeitar H₀ quando El </w:t>
+      </w:r>
+      <w:proofErr w:type="spellStart"/>
+      <w:r>
+        <w:t>Niños</w:t>
+      </w:r>
+      <w:proofErr w:type="spellEnd"/>
+      <w:r>
+        <w:t xml:space="preserve"> são agrupados sem controle do AMM. El </w:t>
+      </w:r>
+      <w:proofErr w:type="spellStart"/>
+      <w:r>
+        <w:t>Niño</w:t>
+      </w:r>
+      <w:proofErr w:type="spellEnd"/>
+      <w:r>
+        <w:t xml:space="preserve"> + AMM+ cancela a seca, diluindo o efeito méd</w:t>
+      </w:r>
+      <w:r>
+        <w:t>io do grupo.</w:t>
       </w:r>
     </w:p>
     <w:p>
@@ -494,12 +1499,68 @@
     </w:p>
     <w:p>
       <w:r>
-        <w:t>• Quixadá-CE (lag ONI = 3 meses): R² = 0,546 | ONI_lag = −42,4 mm/°C (p = 0,0015) | AMM_lag não significativo lag=1 (p = 0,128) | sazonalidade dominante (p &lt; 10⁻¹⁶).</w:t>
-      </w:r>
-    </w:p>
-    <w:p>
-      <w:r>
-        <w:t>• Lajeado-RS (lag ONI = 0): R² = 0,278 | ONI_lag = +140,7 mm/°C (p &lt; 10⁻⁶). Direção oposta: ONI ↑ → chuva ↑ no Sul.</w:t>
+        <w:t>• Quixadá-CE (</w:t>
+      </w:r>
+      <w:proofErr w:type="spellStart"/>
+      <w:r>
+        <w:t>lag</w:t>
+      </w:r>
+      <w:proofErr w:type="spellEnd"/>
+      <w:r>
+        <w:t xml:space="preserve"> ONI = 3 meses): R² = 0,546 | </w:t>
+      </w:r>
+      <w:proofErr w:type="spellStart"/>
+      <w:r>
+        <w:t>ONI_lag</w:t>
+      </w:r>
+      <w:proofErr w:type="spellEnd"/>
+      <w:r>
+        <w:t xml:space="preserve"> = −42,4 mm/°C (p = 0,0015) | </w:t>
+      </w:r>
+      <w:proofErr w:type="spellStart"/>
+      <w:r>
+        <w:t>AMM_lag</w:t>
+      </w:r>
+      <w:proofErr w:type="spellEnd"/>
+      <w:r>
+        <w:t xml:space="preserve"> não significativo </w:t>
+      </w:r>
+      <w:proofErr w:type="spellStart"/>
+      <w:r>
+        <w:t>lag</w:t>
+      </w:r>
+      <w:proofErr w:type="spellEnd"/>
+      <w:r>
+        <w:t>=1 (p = 0,128) | sazonalidade dominante (p &lt; 10⁻¹⁶).</w:t>
+      </w:r>
+    </w:p>
+    <w:p>
+      <w:r>
+        <w:t xml:space="preserve">• </w:t>
+      </w:r>
+      <w:proofErr w:type="spellStart"/>
+      <w:r>
+        <w:t>Lajeado-RS</w:t>
+      </w:r>
+      <w:proofErr w:type="spellEnd"/>
+      <w:r>
+        <w:t xml:space="preserve"> (</w:t>
+      </w:r>
+      <w:proofErr w:type="spellStart"/>
+      <w:r>
+        <w:t>lag</w:t>
+      </w:r>
+      <w:proofErr w:type="spellEnd"/>
+      <w:r>
+        <w:t xml:space="preserve"> ONI = 0): R² = 0,278 | </w:t>
+      </w:r>
+      <w:proofErr w:type="spellStart"/>
+      <w:r>
+        <w:t>ONI_lag</w:t>
+      </w:r>
+      <w:proofErr w:type="spellEnd"/>
+      <w:r>
+        <w:t xml:space="preserve"> = +140,7 mm/°C (p &lt; 10⁻⁶). Direção oposta: ONI ↑ → chuva ↑ no Sul.</w:t>
       </w:r>
     </w:p>
     <w:p>
@@ -512,32 +1573,113 @@
         <w:pStyle w:val="Ttulo2"/>
       </w:pPr>
       <w:r>
-        <w:t>5.6 AMM × Precipitação e Interação ONI×AMM (Seção 6.4)</w:t>
-      </w:r>
-    </w:p>
-    <w:p>
-      <w:r>
-        <w:t>• AMM: lag ótimo = 5 meses | r = +0,378 | p &lt; 0,0001 (Quixadá-CE). Mais forte que qualquer lag com ONI isolado.</w:t>
-      </w:r>
-    </w:p>
-    <w:p>
-      <w:r>
-        <w:t>• Quadrante El Niño + AMM−: mediana = 17,6 mm (seca confirmada). El Niño + AMM+: mediana = 15,0 mm (Atlântico atenua).</w:t>
-      </w:r>
-    </w:p>
-    <w:p>
-      <w:r>
-        <w:t>• Explicação 2024: AMM atingiu +4,02 em fev/2024 com El Niño ativo → chuvas recordes no Sertão. O S.ENSO é o único sistema que captura essa interação.</w:t>
-      </w:r>
-    </w:p>
-    <w:p>
-      <w:r>
-        <w:t>• GPAT: lag ótimo = 0 meses | r = −0,346 | p &lt; 0,0001 (Quixadá-CE). Sinal oposto ao AMM (GPAT &gt; 0 = menos chuva). Interpretação fisicamente consistente: mesmo mecanismo ZCIT.</w:t>
-      </w:r>
-    </w:p>
-    <w:p>
-      <w:r>
-        <w:t>• Lajeado-RS: AMM e GPAT sem correlação significativa — dinâmica subtropical não responde aos índices atlânticos tropicais.</w:t>
+        <w:t xml:space="preserve">5.6 AMM × Precipitação e </w:t>
+      </w:r>
+      <w:r>
+        <w:t>Interação ONI×AMM (Seção 6.4)</w:t>
+      </w:r>
+    </w:p>
+    <w:p>
+      <w:r>
+        <w:t xml:space="preserve">• AMM: </w:t>
+      </w:r>
+      <w:proofErr w:type="spellStart"/>
+      <w:r>
+        <w:t>lag</w:t>
+      </w:r>
+      <w:proofErr w:type="spellEnd"/>
+      <w:r>
+        <w:t xml:space="preserve"> ótimo = 5 meses | r = +0,378 | p &lt; 0,0001 (Quixadá-CE). Mais forte que qualquer </w:t>
+      </w:r>
+      <w:proofErr w:type="spellStart"/>
+      <w:r>
+        <w:t>lag</w:t>
+      </w:r>
+      <w:proofErr w:type="spellEnd"/>
+      <w:r>
+        <w:t xml:space="preserve"> com ONI isolado.</w:t>
+      </w:r>
+    </w:p>
+    <w:p>
+      <w:r>
+        <w:t xml:space="preserve">• Quadrante El </w:t>
+      </w:r>
+      <w:proofErr w:type="spellStart"/>
+      <w:r>
+        <w:t>Niño</w:t>
+      </w:r>
+      <w:proofErr w:type="spellEnd"/>
+      <w:r>
+        <w:t xml:space="preserve"> + AMM−: mediana = 17,6 mm (seca confirmada). El </w:t>
+      </w:r>
+      <w:proofErr w:type="spellStart"/>
+      <w:r>
+        <w:t>Niño</w:t>
+      </w:r>
+      <w:proofErr w:type="spellEnd"/>
+      <w:r>
+        <w:t xml:space="preserve"> + AMM+: mediana = 15,0 mm (Atlântico aten</w:t>
+      </w:r>
+      <w:r>
+        <w:t>ua).</w:t>
+      </w:r>
+    </w:p>
+    <w:p>
+      <w:r>
+        <w:t xml:space="preserve">• Explicação 2024: AMM atingiu +4,02 em </w:t>
+      </w:r>
+      <w:proofErr w:type="spellStart"/>
+      <w:r>
+        <w:t>fev</w:t>
+      </w:r>
+      <w:proofErr w:type="spellEnd"/>
+      <w:r>
+        <w:t xml:space="preserve">/2024 com El </w:t>
+      </w:r>
+      <w:proofErr w:type="spellStart"/>
+      <w:r>
+        <w:t>Niño</w:t>
+      </w:r>
+      <w:proofErr w:type="spellEnd"/>
+      <w:r>
+        <w:t xml:space="preserve"> ativo → chuvas recordes no Sertão. O </w:t>
+      </w:r>
+      <w:proofErr w:type="gramStart"/>
+      <w:r>
+        <w:t>S.ENSO</w:t>
+      </w:r>
+      <w:proofErr w:type="gramEnd"/>
+      <w:r>
+        <w:t xml:space="preserve"> é o único sistema que captura essa interação.</w:t>
+      </w:r>
+    </w:p>
+    <w:p>
+      <w:r>
+        <w:t xml:space="preserve">• GPAT: </w:t>
+      </w:r>
+      <w:proofErr w:type="spellStart"/>
+      <w:r>
+        <w:t>lag</w:t>
+      </w:r>
+      <w:proofErr w:type="spellEnd"/>
+      <w:r>
+        <w:t xml:space="preserve"> ótimo = 0 meses | r = −0,346 | p &lt; 0,0001 (Quixadá-CE). Sinal oposto ao AMM (GPAT &gt; 0 = </w:t>
+      </w:r>
+      <w:r>
+        <w:t>menos chuva). Interpretação fisicamente consistente: mesmo mecanismo ZCIT.</w:t>
+      </w:r>
+    </w:p>
+    <w:p>
+      <w:r>
+        <w:t xml:space="preserve">• </w:t>
+      </w:r>
+      <w:proofErr w:type="spellStart"/>
+      <w:r>
+        <w:t>Lajeado-RS</w:t>
+      </w:r>
+      <w:proofErr w:type="spellEnd"/>
+      <w:r>
+        <w:t>: AMM e GPAT sem correlação significativa — dinâmica subtropical não responde aos índices atlânticos tropicais.</w:t>
       </w:r>
     </w:p>
     <w:p>
@@ -550,7 +1692,10 @@
     </w:p>
     <w:p>
       <w:r>
-        <w:t>• Derivada ONI série histórica: ΔONI mais recente = +0,20°C/mês (aceleração confirmada).</w:t>
+        <w:t xml:space="preserve">• Derivada ONI série </w:t>
+      </w:r>
+      <w:r>
+        <w:t>histórica: ΔONI mais recente = +0,20°C/mês (aceleração confirmada).</w:t>
       </w:r>
     </w:p>
     <w:p>
@@ -559,13 +1704,98 @@
       </w:r>
     </w:p>
     <w:p>
-      <w:r>
-        <w:t>• Integral — Lajeado-RS (set–out–nov): El Niño = 923,4 mm vs. Neutro = 510,6 mm → +80,9%.</w:t>
-      </w:r>
-    </w:p>
-    <w:p>
-      <w:r>
-        <w:t>• Integral — Quixadá-CE (fev–mar–abr): El Niño = 378,0 mm vs. Neutro = 274,3 mm → +37,8% (média amostral; quadrante El Niño+AMM− reverte o sinal).</w:t>
+      <w:pPr>
+        <w:rPr>
+          <w:lang w:val="en-US"/>
+        </w:rPr>
+      </w:pPr>
+      <w:r>
+        <w:rPr>
+          <w:lang w:val="en-US"/>
+        </w:rPr>
+        <w:t xml:space="preserve">• Integral — </w:t>
+      </w:r>
+      <w:proofErr w:type="spellStart"/>
+      <w:r>
+        <w:rPr>
+          <w:lang w:val="en-US"/>
+        </w:rPr>
+        <w:t>Lajeado</w:t>
+      </w:r>
+      <w:proofErr w:type="spellEnd"/>
+      <w:r>
+        <w:rPr>
+          <w:lang w:val="en-US"/>
+        </w:rPr>
+        <w:t>-RS (set–out–</w:t>
+      </w:r>
+      <w:proofErr w:type="spellStart"/>
+      <w:r>
+        <w:rPr>
+          <w:lang w:val="en-US"/>
+        </w:rPr>
+        <w:t>nov</w:t>
+      </w:r>
+      <w:proofErr w:type="spellEnd"/>
+      <w:r>
+        <w:rPr>
+          <w:lang w:val="en-US"/>
+        </w:rPr>
+        <w:t xml:space="preserve">): El Niño = 923,4 mm vs. </w:t>
+      </w:r>
+      <w:proofErr w:type="spellStart"/>
+      <w:r>
+        <w:rPr>
+          <w:lang w:val="en-US"/>
+        </w:rPr>
+        <w:t>Neutro</w:t>
+      </w:r>
+      <w:proofErr w:type="spellEnd"/>
+      <w:r>
+        <w:rPr>
+          <w:lang w:val="en-US"/>
+        </w:rPr>
+        <w:t xml:space="preserve"> = 510,6 mm → +80,9%.</w:t>
+      </w:r>
+    </w:p>
+    <w:p>
+      <w:r>
+        <w:t>• Integ</w:t>
+      </w:r>
+      <w:r>
+        <w:t>ral — Quixadá-CE (</w:t>
+      </w:r>
+      <w:proofErr w:type="spellStart"/>
+      <w:r>
+        <w:t>fev</w:t>
+      </w:r>
+      <w:proofErr w:type="spellEnd"/>
+      <w:r>
+        <w:t>–mar–</w:t>
+      </w:r>
+      <w:proofErr w:type="spellStart"/>
+      <w:r>
+        <w:t>abr</w:t>
+      </w:r>
+      <w:proofErr w:type="spellEnd"/>
+      <w:r>
+        <w:t xml:space="preserve">): El </w:t>
+      </w:r>
+      <w:proofErr w:type="spellStart"/>
+      <w:r>
+        <w:t>Niño</w:t>
+      </w:r>
+      <w:proofErr w:type="spellEnd"/>
+      <w:r>
+        <w:t xml:space="preserve"> = 378,0 mm vs. Neutro = 274,3 mm → +37,8% (média amostral; quadrante El </w:t>
+      </w:r>
+      <w:proofErr w:type="spellStart"/>
+      <w:r>
+        <w:t>Niño+AMM</w:t>
+      </w:r>
+      <w:proofErr w:type="spellEnd"/>
+      <w:r>
+        <w:t>− reverte o sinal).</w:t>
       </w:r>
     </w:p>
     <w:p>
@@ -573,12 +1803,23 @@
         <w:pStyle w:val="Ttulo2"/>
       </w:pPr>
       <w:r>
-        <w:t>5.8 Score de Risco S.ENSO (Seção 8)</w:t>
-      </w:r>
-    </w:p>
-    <w:p>
-      <w:r>
-        <w:t>Função score: 5 componentes (intensidade ONI 0–40, aceleração ΔONI 0–20, sensibilidade municipal via correlação 0,5–1,5, desvio histórico 0–20, índice atlântico GPAT/AMM −15 a +15). Fator janela crítica: ×1,3.</w:t>
+        <w:t xml:space="preserve">5.8 Score de Risco </w:t>
+      </w:r>
+      <w:proofErr w:type="gramStart"/>
+      <w:r>
+        <w:t>S.ENSO</w:t>
+      </w:r>
+      <w:proofErr w:type="gramEnd"/>
+      <w:r>
+        <w:t xml:space="preserve"> (Seção 8)</w:t>
+      </w:r>
+    </w:p>
+    <w:p>
+      <w:r>
+        <w:t>Função score: 5 componentes (intensidade ONI 0–40, aceleração ΔONI 0–20, sensibi</w:t>
+      </w:r>
+      <w:r>
+        <w:t>lidade municipal via correlação 0,5–1,5, desvio histórico 0–20, índice atlântico GPAT/AMM −15 a +15). Fator janela crítica: ×1,3.</w:t>
       </w:r>
     </w:p>
     <w:p>
@@ -588,12 +1829,48 @@
     </w:p>
     <w:p>
       <w:r>
-        <w:t>• Quixadá-CE: Score = 17,8/100 | Nível: VERDE (fora da janela crítica fev–abr)</w:t>
-      </w:r>
-    </w:p>
-    <w:p>
-      <w:r>
-        <w:t>• Lajeado-RS: Score = 28,9/100 | Nível: AMARELO (fora da janela crítica set–nov)</w:t>
+        <w:lastRenderedPageBreak/>
+        <w:t xml:space="preserve">• Quixadá-CE: Score = 17,8/100 | Nível: VERDE (fora da </w:t>
+      </w:r>
+      <w:r>
+        <w:t xml:space="preserve">janela crítica </w:t>
+      </w:r>
+      <w:proofErr w:type="spellStart"/>
+      <w:r>
+        <w:t>fev</w:t>
+      </w:r>
+      <w:proofErr w:type="spellEnd"/>
+      <w:r>
+        <w:t>–</w:t>
+      </w:r>
+      <w:proofErr w:type="spellStart"/>
+      <w:r>
+        <w:t>abr</w:t>
+      </w:r>
+      <w:proofErr w:type="spellEnd"/>
+      <w:r>
+        <w:t>)</w:t>
+      </w:r>
+    </w:p>
+    <w:p>
+      <w:r>
+        <w:t xml:space="preserve">• </w:t>
+      </w:r>
+      <w:proofErr w:type="spellStart"/>
+      <w:r>
+        <w:t>Lajeado-RS</w:t>
+      </w:r>
+      <w:proofErr w:type="spellEnd"/>
+      <w:r>
+        <w:t>: Score = 28,9/100 | Nível: AMARELO (fora da janela crítica set–</w:t>
+      </w:r>
+      <w:proofErr w:type="spellStart"/>
+      <w:r>
+        <w:t>nov</w:t>
+      </w:r>
+      <w:proofErr w:type="spellEnd"/>
+      <w:r>
+        <w:t>)</w:t>
       </w:r>
     </w:p>
     <w:p>
@@ -608,7 +1885,18 @@
     </w:p>
     <w:p>
       <w:r>
-        <w:t>• Lajeado-RS: Score = 61,7/100 | Nível: LARANJA</w:t>
+        <w:t xml:space="preserve">• </w:t>
+      </w:r>
+      <w:proofErr w:type="spellStart"/>
+      <w:r>
+        <w:t>Lajeado-RS</w:t>
+      </w:r>
+      <w:proofErr w:type="spellEnd"/>
+      <w:r>
+        <w:t>: Score = 61,7/100 | Nív</w:t>
+      </w:r>
+      <w:r>
+        <w:t>el: LARANJA</w:t>
       </w:r>
     </w:p>
     <w:p>
@@ -629,7 +1917,34 @@
     </w:p>
     <w:p>
       <w:r>
-        <w:t>• ONI / TSM Niño 3.4: derivado de sensores VIIRS (Suomi NPP/NOAA-20), MODIS (Terra/Aqua) e altímetros radar de satélites NASA/ESA. O ONI é a síntese operacional das anomalias de TSM medidas por esses instrumentos orbitais.</w:t>
+        <w:t xml:space="preserve">• ONI / TSM </w:t>
+      </w:r>
+      <w:proofErr w:type="spellStart"/>
+      <w:r>
+        <w:t>Niño</w:t>
+      </w:r>
+      <w:proofErr w:type="spellEnd"/>
+      <w:r>
+        <w:t xml:space="preserve"> 3.4: derivado de sensores VIIRS (</w:t>
+      </w:r>
+      <w:proofErr w:type="spellStart"/>
+      <w:r>
+        <w:t>Suomi</w:t>
+      </w:r>
+      <w:proofErr w:type="spellEnd"/>
+      <w:r>
+        <w:t xml:space="preserve"> NPP/NOAA-20), MODIS (Terra/</w:t>
+      </w:r>
+      <w:proofErr w:type="spellStart"/>
+      <w:r>
+        <w:t>Aqua</w:t>
+      </w:r>
+      <w:proofErr w:type="spellEnd"/>
+      <w:r>
+        <w:t>) e altímetros radar de satélites NASA/ESA. O ONI é a síntese operacional das anomalias d</w:t>
+      </w:r>
+      <w:r>
+        <w:t>e TSM medidas por esses instrumentos orbitais.</w:t>
       </w:r>
     </w:p>
     <w:p>
@@ -639,7 +1954,26 @@
     </w:p>
     <w:p>
       <w:r>
-        <w:t>• SSH ENSO Indicator (NASA PO.DAAC): DESCARTADO do escopo final. A autenticação NASA Earthdata adicionava complexidade sem benefício adicional. Argumento orbital permanece válido via ONI + AMM/GPAT.</w:t>
+        <w:t xml:space="preserve">• SSH ENSO Indicator (NASA </w:t>
+      </w:r>
+      <w:proofErr w:type="gramStart"/>
+      <w:r>
+        <w:t>PO.DAAC</w:t>
+      </w:r>
+      <w:proofErr w:type="gramEnd"/>
+      <w:r>
+        <w:t>): DESCARTADO do escopo final. A autentic</w:t>
+      </w:r>
+      <w:r>
+        <w:t xml:space="preserve">ação NASA </w:t>
+      </w:r>
+      <w:proofErr w:type="spellStart"/>
+      <w:r>
+        <w:t>Earthdata</w:t>
+      </w:r>
+      <w:proofErr w:type="spellEnd"/>
+      <w:r>
+        <w:t xml:space="preserve"> adicionava complexidade sem benefício adicional. Argumento orbital permanece válido via ONI + AMM/GPAT.</w:t>
       </w:r>
     </w:p>
     <w:p>
@@ -647,12 +1981,31 @@
         <w:pStyle w:val="Ttulo2"/>
       </w:pPr>
       <w:r>
-        <w:t>6.2 Narrativa para o Pitch</w:t>
-      </w:r>
-    </w:p>
-    <w:p>
-      <w:r>
-        <w:t>"O sinal preditivo do sistema vem integralmente de dados orbitais: sensores embarcados em satélites da NASA e NOAA monitoram anomalias de temperatura do Pacífico e do Atlântico Tropical em tempo real. O S.ENSO transforma esses sinais oceânicos em alertas municipais interpretáveis com antecedência de 3 a 6 meses — antes que qualquer sensor terrestre detecte o impacto no campo."</w:t>
+        <w:t xml:space="preserve">6.2 Narrativa para o </w:t>
+      </w:r>
+      <w:proofErr w:type="spellStart"/>
+      <w:r>
+        <w:t>Pitch</w:t>
+      </w:r>
+      <w:proofErr w:type="spellEnd"/>
+    </w:p>
+    <w:p>
+      <w:r>
+        <w:t>"O sinal preditivo do sistema vem integralmente de dados orbitais: sensores embarcados em satélites da NA</w:t>
+      </w:r>
+      <w:r>
+        <w:t xml:space="preserve">SA e NOAA monitoram anomalias de temperatura do Pacífico e do Atlântico Tropical em tempo real. O </w:t>
+      </w:r>
+      <w:proofErr w:type="gramStart"/>
+      <w:r>
+        <w:t>S.ENSO</w:t>
+      </w:r>
+      <w:proofErr w:type="gramEnd"/>
+      <w:r>
+        <w:t xml:space="preserve"> transforma esses sinais oceânicos em alertas municipais interpretáveis com antecedência de 3 a 6 meses — antes que qualquer sensor terrestre detecte o </w:t>
+      </w:r>
+      <w:r>
+        <w:t>impacto no campo."</w:t>
       </w:r>
     </w:p>
     <w:p>
@@ -678,17 +2031,39 @@
     </w:p>
     <w:p>
       <w:r>
-        <w:t>• [FEITO] Notebook executado do início ao fim sem erros (58 células, 9 seções).</w:t>
-      </w:r>
-    </w:p>
-    <w:p>
-      <w:r>
-        <w:t>• [FEITO] Resultados estatísticos validados: lag correlation, Mann-Whitney, regressão OLS, interação ONI×AMM, correlação GPAT.</w:t>
-      </w:r>
-    </w:p>
-    <w:p>
-      <w:r>
-        <w:t>• [FEITO] Score de risco implementado com GPAT como índice atlântico operacional e bug de sinal corrigido (correlação assinada).</w:t>
+        <w:t xml:space="preserve">• [FEITO] Notebook executado do início ao fim sem erros (58 células, 9 </w:t>
+      </w:r>
+      <w:r>
+        <w:t>seções).</w:t>
+      </w:r>
+    </w:p>
+    <w:p>
+      <w:r>
+        <w:t xml:space="preserve">• [FEITO] Resultados estatísticos validados: </w:t>
+      </w:r>
+      <w:proofErr w:type="spellStart"/>
+      <w:r>
+        <w:t>lag</w:t>
+      </w:r>
+      <w:proofErr w:type="spellEnd"/>
+      <w:r>
+        <w:t xml:space="preserve"> </w:t>
+      </w:r>
+      <w:proofErr w:type="spellStart"/>
+      <w:r>
+        <w:t>correlation</w:t>
+      </w:r>
+      <w:proofErr w:type="spellEnd"/>
+      <w:r>
+        <w:t>, Mann-Whitney, regressão OLS, interação ONI×AMM, correlação GPAT.</w:t>
+      </w:r>
+    </w:p>
+    <w:p>
+      <w:r>
+        <w:t>• [FEITO] Score de risco implementado com GPAT como índice atlântico operacional e bug de sinal corrigido (correlação as</w:t>
+      </w:r>
+      <w:r>
+        <w:t>sinada).</w:t>
       </w:r>
     </w:p>
     <w:p>
@@ -698,9 +2073,37 @@
     </w:p>
     <w:p>
       <w:r>
-        <w:t>• [FEITO] Plano das 9 células markdown interpretativas criado (plano_markdowns_notebook.md).</w:t>
-      </w:r>
-    </w:p>
+        <w:t xml:space="preserve">• [FEITO] Plano das 9 células </w:t>
+      </w:r>
+      <w:proofErr w:type="spellStart"/>
+      <w:r>
+        <w:t>markdown</w:t>
+      </w:r>
+      <w:proofErr w:type="spellEnd"/>
+      <w:r>
+        <w:t xml:space="preserve"> interpretativas criado (plano_markdowns_notebook.md).</w:t>
+      </w:r>
+    </w:p>
+    <w:p>
+      <w:r>
+        <w:t xml:space="preserve">• </w:t>
+      </w:r>
+      <w:r>
+        <w:t xml:space="preserve">[FEITO] </w:t>
+      </w:r>
+      <w:r>
+        <w:t xml:space="preserve">Inserir as 9 células </w:t>
+      </w:r>
+      <w:proofErr w:type="spellStart"/>
+      <w:r>
+        <w:t>markdown</w:t>
+      </w:r>
+      <w:proofErr w:type="spellEnd"/>
+      <w:r>
+        <w:t xml:space="preserve"> interpretativas no notebook (plano disponível em plano_markdowns_notebook.md).</w:t>
+      </w:r>
+    </w:p>
+    <w:p/>
     <w:p>
       <w:pPr>
         <w:pStyle w:val="Ttulo2"/>
@@ -711,12 +2114,15 @@
     </w:p>
     <w:p>
       <w:r>
-        <w:t>• Inserir as 9 células markdown interpretativas no notebook (plano disponível em plano_markdowns_notebook.md).</w:t>
-      </w:r>
-    </w:p>
-    <w:p>
-      <w:r>
-        <w:t>• Revisão final da Seção 9 (conclusão e ODS) após inserção dos markdowns.</w:t>
+        <w:t xml:space="preserve">• Revisão final da Seção 9 (conclusão e ODS) após inserção dos </w:t>
+      </w:r>
+      <w:proofErr w:type="spellStart"/>
+      <w:r>
+        <w:t>markdowns</w:t>
+      </w:r>
+      <w:proofErr w:type="spellEnd"/>
+      <w:r>
+        <w:t>.</w:t>
       </w:r>
     </w:p>
     <w:p>
@@ -726,7 +2132,18 @@
     </w:p>
     <w:p>
       <w:r>
-        <w:t>• Preparação do pitch: roteiro de 5 minutos conectando pipeline técnico às personas e ODS.</w:t>
+        <w:t>• Prep</w:t>
+      </w:r>
+      <w:r>
+        <w:t xml:space="preserve">aração do </w:t>
+      </w:r>
+      <w:proofErr w:type="spellStart"/>
+      <w:r>
+        <w:t>pitch</w:t>
+      </w:r>
+      <w:proofErr w:type="spellEnd"/>
+      <w:r>
+        <w:t>: roteiro de 5 minutos conectando pipeline técnico às personas e ODS.</w:t>
       </w:r>
     </w:p>
     <w:p>
@@ -742,6 +2159,7 @@
         <w:pStyle w:val="Ttulo2"/>
       </w:pPr>
       <w:r>
+        <w:lastRenderedPageBreak/>
         <w:t>8.1 Documentos de Referência (somente leitura)</w:t>
       </w:r>
     </w:p>
@@ -752,7 +2170,18 @@
     </w:p>
     <w:p>
       <w:r>
-        <w:t>• Escopo e Planos/Estrutura Notebook.md — Outline definitivo das 9 seções</w:t>
+        <w:t xml:space="preserve">• Escopo e Planos/Estrutura Notebook.md </w:t>
+      </w:r>
+      <w:r>
+        <w:t xml:space="preserve">— </w:t>
+      </w:r>
+      <w:proofErr w:type="spellStart"/>
+      <w:r>
+        <w:t>Outline</w:t>
+      </w:r>
+      <w:proofErr w:type="spellEnd"/>
+      <w:r>
+        <w:t xml:space="preserve"> definitivo das 9 seções</w:t>
       </w:r>
     </w:p>
     <w:p>
@@ -772,7 +2201,26 @@
     </w:p>
     <w:p>
       <w:r>
-        <w:t>• Pesquisa/ — PDFs e DOCX com números El Niño 2026</w:t>
+        <w:t xml:space="preserve">• Pesquisa/ — </w:t>
+      </w:r>
+      <w:proofErr w:type="spellStart"/>
+      <w:r>
+        <w:t>PDFs</w:t>
+      </w:r>
+      <w:proofErr w:type="spellEnd"/>
+      <w:r>
+        <w:t xml:space="preserve"> e DOCX com números El </w:t>
+      </w:r>
+      <w:proofErr w:type="spellStart"/>
+      <w:r>
+        <w:t>Ni</w:t>
+      </w:r>
+      <w:r>
+        <w:t>ño</w:t>
+      </w:r>
+      <w:proofErr w:type="spellEnd"/>
+      <w:r>
+        <w:t xml:space="preserve"> 2026</w:t>
       </w:r>
     </w:p>
     <w:p>
@@ -785,7 +2233,20 @@
     </w:p>
     <w:p>
       <w:r>
-        <w:t>• SENSO_notebook_rascunho.ipynb — Notebook Python completo, 58 células, executado</w:t>
+        <w:t xml:space="preserve">• </w:t>
+      </w:r>
+      <w:proofErr w:type="spellStart"/>
+      <w:r>
+        <w:t>SENSO_notebook_</w:t>
+      </w:r>
+      <w:proofErr w:type="gramStart"/>
+      <w:r>
+        <w:t>rascunho.ipynb</w:t>
+      </w:r>
+      <w:proofErr w:type="spellEnd"/>
+      <w:proofErr w:type="gramEnd"/>
+      <w:r>
+        <w:t xml:space="preserve"> — Notebook Python completo, 58 células, executado</w:t>
       </w:r>
     </w:p>
     <w:p>
@@ -795,12 +2256,47 @@
     </w:p>
     <w:p>
       <w:r>
-        <w:t>• plano_markdowns_notebook.md — Plano das 9 células interpretativas (com cell_id e texto)</w:t>
-      </w:r>
-    </w:p>
-    <w:p>
-      <w:r>
-        <w:t>• figuras/ — 9 figuras geradas (fig1 a fig9): boxplots, lag correlation, regressão, AMM, projeção</w:t>
+        <w:t xml:space="preserve">• plano_markdowns_notebook.md — Plano das 9 células interpretativas (com </w:t>
+      </w:r>
+      <w:proofErr w:type="spellStart"/>
+      <w:r>
+        <w:t>cell_id</w:t>
+      </w:r>
+      <w:proofErr w:type="spellEnd"/>
+      <w:r>
+        <w:t xml:space="preserve"> e texto)</w:t>
+      </w:r>
+    </w:p>
+    <w:p>
+      <w:r>
+        <w:t>• figuras/ — 9 f</w:t>
+      </w:r>
+      <w:r>
+        <w:t xml:space="preserve">iguras geradas (fig1 a fig9): </w:t>
+      </w:r>
+      <w:proofErr w:type="spellStart"/>
+      <w:r>
+        <w:t>boxplots</w:t>
+      </w:r>
+      <w:proofErr w:type="spellEnd"/>
+      <w:r>
+        <w:t xml:space="preserve">, </w:t>
+      </w:r>
+      <w:proofErr w:type="spellStart"/>
+      <w:r>
+        <w:t>lag</w:t>
+      </w:r>
+      <w:proofErr w:type="spellEnd"/>
+      <w:r>
+        <w:t xml:space="preserve"> </w:t>
+      </w:r>
+      <w:proofErr w:type="spellStart"/>
+      <w:r>
+        <w:t>correlation</w:t>
+      </w:r>
+      <w:proofErr w:type="spellEnd"/>
+      <w:r>
+        <w:t>, regressão, AMM, projeção</w:t>
       </w:r>
     </w:p>
     <w:p>
@@ -813,7 +2309,15 @@
         <w:pStyle w:val="Ttulo2"/>
       </w:pPr>
       <w:r>
-        <w:t>8.3 Dados Coletados (data/raw/)</w:t>
+        <w:t>8.3 Dados Coletados (data/</w:t>
+      </w:r>
+      <w:proofErr w:type="spellStart"/>
+      <w:r>
+        <w:t>raw</w:t>
+      </w:r>
+      <w:proofErr w:type="spellEnd"/>
+      <w:r>
+        <w:t>/)</w:t>
       </w:r>
     </w:p>
     <w:p>
@@ -823,12 +2327,31 @@
     </w:p>
     <w:p>
       <w:r>
-        <w:t>• tsm_nino34_mensal.csv — TSM mensal Niño 3.4</w:t>
-      </w:r>
-    </w:p>
-    <w:p>
-      <w:r>
-        <w:t>• amm_mensal.csv — AMM NOAA/PSL (1948–ago/2024, 921 registros)</w:t>
+        <w:t>• tsm_nino34_mensal.csv — T</w:t>
+      </w:r>
+      <w:r>
+        <w:t xml:space="preserve">SM mensal </w:t>
+      </w:r>
+      <w:proofErr w:type="spellStart"/>
+      <w:r>
+        <w:t>Niño</w:t>
+      </w:r>
+      <w:proofErr w:type="spellEnd"/>
+      <w:r>
+        <w:t xml:space="preserve"> 3.4</w:t>
+      </w:r>
+    </w:p>
+    <w:p>
+      <w:r>
+        <w:t>• amm_mensal.csv — AMM NOAA/PSL (1948–</w:t>
+      </w:r>
+      <w:proofErr w:type="spellStart"/>
+      <w:r>
+        <w:t>ago</w:t>
+      </w:r>
+      <w:proofErr w:type="spellEnd"/>
+      <w:r>
+        <w:t>/2024, 921 registros)</w:t>
       </w:r>
     </w:p>
     <w:p>
@@ -843,7 +2366,10 @@
     </w:p>
     <w:p>
       <w:r>
-        <w:t>• producao_agricola.csv — Rendimento agrícola IBGE/PAM (milho e trigo)</w:t>
+        <w:t xml:space="preserve">• producao_agricola.csv — Rendimento </w:t>
+      </w:r>
+      <w:r>
+        <w:t>agrícola IBGE/PAM (milho e trigo)</w:t>
       </w:r>
     </w:p>
     <w:p>
@@ -863,12 +2389,31 @@
     </w:p>
     <w:p>
       <w:r>
-        <w:t>• INMET BDMEP/RIO GRANDE DO SUL/ — A840 Bento Gonçalves (2006–2026) + A882 Teutônia (2012–2026)</w:t>
-      </w:r>
-    </w:p>
-    <w:p>
-      <w:r>
-        <w:t>• ssh_enso/*.txt — NASA SSH ENSO Indicator (referência histórica, não utilizado no MVP)</w:t>
+        <w:t>• INME</w:t>
+      </w:r>
+      <w:r>
+        <w:t>T BDMEP/RIO GRANDE DO SUL/ — A840 Bento Gonçalves (2006–2026) + A882 Teutônia (2012–2026)</w:t>
+      </w:r>
+    </w:p>
+    <w:p>
+      <w:r>
+        <w:t xml:space="preserve">• </w:t>
+      </w:r>
+      <w:proofErr w:type="spellStart"/>
+      <w:r>
+        <w:t>ssh_enso</w:t>
+      </w:r>
+      <w:proofErr w:type="spellEnd"/>
+      <w:r>
+        <w:t>/*.</w:t>
+      </w:r>
+      <w:proofErr w:type="spellStart"/>
+      <w:r>
+        <w:t>txt</w:t>
+      </w:r>
+      <w:proofErr w:type="spellEnd"/>
+      <w:r>
+        <w:t xml:space="preserve"> — NASA SSH ENSO Indicator (referência histórica, não utilizado no MVP)</w:t>
       </w:r>
     </w:p>
     <w:p>

</xml_diff>